<commit_message>
feat: remover seção do about; chore: atualizar arquivos de currículo e foto
</commit_message>
<xml_diff>
--- a/public/cv/CurriculoEst.docx
+++ b/public/cv/CurriculoEst.docx
@@ -27,17 +27,17 @@
     </w:p>
     <w:p>
       <w:pPr>
-        <w:ind w:left="0" w:firstLine="0"/>
-        <w:rPr>
-          <w:rFonts w:ascii="Calibri" w:cs="Calibri" w:eastAsia="Calibri" w:hAnsi="Calibri"/>
-        </w:rPr>
-      </w:pPr>
-      <w:r>
-        <w:rPr>
-          <w:rFonts w:ascii="Calibri" w:cs="Calibri" w:eastAsia="Calibri" w:hAnsi="Calibri"/>
-          <w:rtl w:val="0"/>
-        </w:rPr>
-        <w:t xml:space="preserve">Desenvolvedor Full Stack | Next.Js | Node.js | React | Fastify</w:t>
+        <w:spacing w:after="240" w:before="240" w:lineRule="auto"/>
+        <w:rPr>
+          <w:rFonts w:ascii="Calibri" w:cs="Calibri" w:eastAsia="Calibri" w:hAnsi="Calibri"/>
+        </w:rPr>
+      </w:pPr>
+      <w:r>
+        <w:rPr>
+          <w:rFonts w:ascii="Calibri" w:cs="Calibri" w:eastAsia="Calibri" w:hAnsi="Calibri"/>
+          <w:rtl w:val="0"/>
+        </w:rPr>
+        <w:t xml:space="preserve">Desenvolvedor Full Stack | Node.js |React | Next.js | TypeScript</w:t>
       </w:r>
     </w:p>
     <w:p>
@@ -82,11 +82,7 @@
       <w:pPr>
         <w:ind w:left="0" w:firstLine="0"/>
         <w:rPr>
-          <w:rFonts w:ascii="Roboto" w:cs="Roboto" w:eastAsia="Roboto" w:hAnsi="Roboto"/>
-          <w:color w:val="1f1f1f"/>
-          <w:sz w:val="21"/>
-          <w:szCs w:val="21"/>
-          <w:shd w:fill="e9eef6" w:val="clear"/>
+          <w:rFonts w:ascii="Calibri" w:cs="Calibri" w:eastAsia="Calibri" w:hAnsi="Calibri"/>
         </w:rPr>
       </w:pPr>
       <w:r>
@@ -176,14 +172,22 @@
         </w:rPr>
         <w:t xml:space="preserve"> </w:t>
       </w:r>
-    </w:p>
-    <w:p>
-      <w:pPr>
-        <w:ind w:left="0" w:firstLine="0"/>
-        <w:rPr>
-          <w:rFonts w:ascii="Calibri" w:cs="Calibri" w:eastAsia="Calibri" w:hAnsi="Calibri"/>
-          <w:b w:val="1"/>
-          <w:bCs w:val="1"/>
+      <w:r>
+        <w:rPr>
+          <w:rtl w:val="0"/>
+        </w:rPr>
+      </w:r>
+    </w:p>
+    <w:p>
+      <w:pPr>
+        <w:spacing w:after="240" w:before="240" w:lineRule="auto"/>
+        <w:ind w:left="0" w:right="600" w:firstLine="0"/>
+        <w:rPr>
+          <w:rFonts w:ascii="Calibri" w:cs="Calibri" w:eastAsia="Calibri" w:hAnsi="Calibri"/>
+          <w:b w:val="1"/>
+          <w:bCs w:val="1"/>
+          <w:i w:val="1"/>
+          <w:iCs w:val="1"/>
           <w:sz w:val="32"/>
           <w:szCs w:val="32"/>
         </w:rPr>
@@ -193,51 +197,40 @@
           <w:rFonts w:ascii="Calibri" w:cs="Calibri" w:eastAsia="Calibri" w:hAnsi="Calibri"/>
           <w:b w:val="1"/>
           <w:bCs w:val="1"/>
+          <w:i w:val="1"/>
+          <w:iCs w:val="1"/>
           <w:sz w:val="32"/>
           <w:szCs w:val="32"/>
           <w:rtl w:val="0"/>
         </w:rPr>
-        <w:t xml:space="preserve">Objetivo</w:t>
-      </w:r>
-    </w:p>
-    <w:p>
-      <w:pPr>
-        <w:spacing w:after="240" w:before="240" w:lineRule="auto"/>
-        <w:rPr>
-          <w:rFonts w:ascii="Calibri" w:cs="Calibri" w:eastAsia="Calibri" w:hAnsi="Calibri"/>
-        </w:rPr>
-      </w:pPr>
-      <w:r>
-        <w:rPr>
-          <w:rFonts w:ascii="Calibri" w:cs="Calibri" w:eastAsia="Calibri" w:hAnsi="Calibri"/>
-          <w:rtl w:val="0"/>
-        </w:rPr>
-        <w:t xml:space="preserve">Busco oportunidade de </w:t>
-      </w:r>
-      <w:r>
-        <w:rPr>
-          <w:rFonts w:ascii="Calibri" w:cs="Calibri" w:eastAsia="Calibri" w:hAnsi="Calibri"/>
-          <w:b w:val="1"/>
-          <w:bCs w:val="1"/>
-          <w:rtl w:val="0"/>
-        </w:rPr>
-        <w:t xml:space="preserve">Estágio em Desenvolvimento Full Stack, Back-end ou Front-end</w:t>
-      </w:r>
-      <w:r>
-        <w:rPr>
-          <w:rFonts w:ascii="Calibri" w:cs="Calibri" w:eastAsia="Calibri" w:hAnsi="Calibri"/>
-          <w:rtl w:val="0"/>
-        </w:rPr>
-        <w:t xml:space="preserve">, com preferência por atuação remota (Home Office), com disponibilidade de horários flexíveis e foco em aprendizado prático.</w:t>
-      </w:r>
-    </w:p>
-    <w:p>
-      <w:pPr>
-        <w:ind w:left="0" w:firstLine="0"/>
-        <w:rPr>
-          <w:rFonts w:ascii="Calibri" w:cs="Calibri" w:eastAsia="Calibri" w:hAnsi="Calibri"/>
-          <w:b w:val="1"/>
-          <w:bCs w:val="1"/>
+        <w:t xml:space="preserve">Resumo </w:t>
+      </w:r>
+    </w:p>
+    <w:p>
+      <w:pPr>
+        <w:spacing w:after="240" w:before="240" w:lineRule="auto"/>
+        <w:ind w:left="0" w:right="600" w:firstLine="0"/>
+        <w:rPr>
+          <w:rFonts w:ascii="Calibri" w:cs="Calibri" w:eastAsia="Calibri" w:hAnsi="Calibri"/>
+        </w:rPr>
+      </w:pPr>
+      <w:r>
+        <w:rPr>
+          <w:rFonts w:ascii="Calibri" w:cs="Calibri" w:eastAsia="Calibri" w:hAnsi="Calibri"/>
+          <w:rtl w:val="0"/>
+        </w:rPr>
+        <w:t xml:space="preserve">Estudante de Análise e Desenvolvimento de Sistemas focado na construção de aplicações com TypeScript. Tenho prática no desenvolvimento Full Stack (Node.js, Fastify, React e Next.js), aplicando boas práticas de arquitetura e integração, modelagem de dados relacionais e conteinerização (Docker). </w:t>
+      </w:r>
+    </w:p>
+    <w:p>
+      <w:pPr>
+        <w:spacing w:after="240" w:before="240" w:lineRule="auto"/>
+        <w:rPr>
+          <w:rFonts w:ascii="Calibri" w:cs="Calibri" w:eastAsia="Calibri" w:hAnsi="Calibri"/>
+          <w:b w:val="1"/>
+          <w:bCs w:val="1"/>
+          <w:i w:val="1"/>
+          <w:iCs w:val="1"/>
           <w:sz w:val="32"/>
           <w:szCs w:val="32"/>
         </w:rPr>
@@ -247,347 +240,425 @@
           <w:rFonts w:ascii="Calibri" w:cs="Calibri" w:eastAsia="Calibri" w:hAnsi="Calibri"/>
           <w:b w:val="1"/>
           <w:bCs w:val="1"/>
+          <w:i w:val="1"/>
+          <w:iCs w:val="1"/>
           <w:sz w:val="32"/>
           <w:szCs w:val="32"/>
           <w:rtl w:val="0"/>
         </w:rPr>
-        <w:t xml:space="preserve">Highlights </w:t>
-      </w:r>
-    </w:p>
-    <w:p>
-      <w:pPr>
-        <w:spacing w:after="240" w:before="240" w:lineRule="auto"/>
-        <w:rPr>
-          <w:rFonts w:ascii="Calibri" w:cs="Calibri" w:eastAsia="Calibri" w:hAnsi="Calibri"/>
-        </w:rPr>
-      </w:pPr>
-      <w:r>
-        <w:rPr>
-          <w:rFonts w:ascii="Calibri" w:cs="Calibri" w:eastAsia="Calibri" w:hAnsi="Calibri"/>
-          <w:rtl w:val="0"/>
-        </w:rPr>
-        <w:t xml:space="preserve">Desenvolvedor Full Stack com experiência prática na construção de ecossistemas de e-commerce completos, incluindo frontend dinâmico com Next.js, backend de alta performance com Fastify e integrações financeiras complexas com Stripe (checkout, assinaturas recorrentes e webhooks). Forte foco em segurança (2FA, JWT, DAL), performance (cache com Redis) e DevOps (Docker). Habilidades em TypeScript, Prisma ORM, PostgreSQL e React</w:t>
-      </w:r>
-    </w:p>
-    <w:p>
-      <w:pPr>
-        <w:ind w:left="0" w:firstLine="0"/>
-        <w:rPr>
-          <w:rFonts w:ascii="Calibri" w:cs="Calibri" w:eastAsia="Calibri" w:hAnsi="Calibri"/>
-          <w:b w:val="1"/>
-          <w:bCs w:val="1"/>
+        <w:t xml:space="preserve">Projetos de Software e Portfólio (Autônomos) </w:t>
+      </w:r>
+    </w:p>
+    <w:p>
+      <w:pPr>
+        <w:spacing w:after="240" w:before="240" w:lineRule="auto"/>
+        <w:rPr>
+          <w:rFonts w:ascii="Calibri" w:cs="Calibri" w:eastAsia="Calibri" w:hAnsi="Calibri"/>
+        </w:rPr>
+      </w:pPr>
+      <w:r>
+        <w:rPr>
+          <w:rFonts w:ascii="Calibri" w:cs="Calibri" w:eastAsia="Calibri" w:hAnsi="Calibri"/>
+          <w:b w:val="1"/>
+          <w:bCs w:val="1"/>
+          <w:rtl w:val="0"/>
+        </w:rPr>
+        <w:t xml:space="preserve">E-commerce SaaS &amp; Stripe Custom Checkout (Projeto Full Stack)</w:t>
+      </w:r>
+      <w:r>
+        <w:rPr>
+          <w:rFonts w:ascii="Calibri" w:cs="Calibri" w:eastAsia="Calibri" w:hAnsi="Calibri"/>
+          <w:rtl w:val="0"/>
+        </w:rPr>
+        <w:t xml:space="preserve"> | </w:t>
+      </w:r>
+      <w:r>
+        <w:rPr>
+          <w:rFonts w:ascii="Calibri" w:cs="Calibri" w:eastAsia="Calibri" w:hAnsi="Calibri"/>
           <w:i w:val="1"/>
           <w:iCs w:val="1"/>
-        </w:rPr>
-      </w:pPr>
-      <w:r>
+          <w:rtl w:val="0"/>
+        </w:rPr>
+        <w:t xml:space="preserve">2026</w:t>
+      </w:r>
+      <w:r>
+        <w:rPr>
+          <w:rFonts w:ascii="Calibri" w:cs="Calibri" w:eastAsia="Calibri" w:hAnsi="Calibri"/>
+          <w:rtl w:val="0"/>
+        </w:rPr>
+        <w:t xml:space="preserve"> </w:t>
+      </w:r>
+    </w:p>
+    <w:p>
+      <w:pPr>
+        <w:spacing w:after="240" w:before="240" w:lineRule="auto"/>
+        <w:rPr>
+          <w:rFonts w:ascii="Calibri" w:cs="Calibri" w:eastAsia="Calibri" w:hAnsi="Calibri"/>
+          <w:i w:val="1"/>
+          <w:iCs w:val="1"/>
+        </w:rPr>
+      </w:pPr>
+      <w:r>
+        <w:rPr>
+          <w:rFonts w:ascii="Calibri" w:cs="Calibri" w:eastAsia="Calibri" w:hAnsi="Calibri"/>
+          <w:i w:val="1"/>
+          <w:iCs w:val="1"/>
+          <w:rtl w:val="0"/>
+        </w:rPr>
+        <w:t xml:space="preserve">P</w:t>
+      </w:r>
+      <w:r>
+        <w:rPr>
+          <w:rFonts w:ascii="Calibri" w:cs="Calibri" w:eastAsia="Calibri" w:hAnsi="Calibri"/>
+          <w:rtl w:val="0"/>
+        </w:rPr>
+        <w:t xml:space="preserve">rojeto desenvolvido de forma autônoma, aplicando na prática conceitos de arquitetura web com Next.js, React e TypeS</w:t>
+      </w:r>
+      <w:r>
+        <w:rPr>
+          <w:rFonts w:ascii="Calibri" w:cs="Calibri" w:eastAsia="Calibri" w:hAnsi="Calibri"/>
+          <w:i w:val="1"/>
+          <w:iCs w:val="1"/>
+          <w:rtl w:val="0"/>
+        </w:rPr>
+        <w:t xml:space="preserve">cript.</w:t>
+      </w:r>
+    </w:p>
+    <w:p>
+      <w:pPr>
+        <w:spacing w:after="240" w:before="240" w:lineRule="auto"/>
+        <w:ind w:left="0" w:firstLine="0"/>
+        <w:rPr>
+          <w:rFonts w:ascii="Calibri" w:cs="Calibri" w:eastAsia="Calibri" w:hAnsi="Calibri"/>
+        </w:rPr>
+      </w:pPr>
+      <w:r>
+        <w:rPr>
+          <w:rFonts w:ascii="Calibri" w:cs="Calibri" w:eastAsia="Calibri" w:hAnsi="Calibri"/>
+          <w:b w:val="1"/>
+          <w:bCs w:val="1"/>
+          <w:rtl w:val="0"/>
+        </w:rPr>
+        <w:t xml:space="preserve">Integração Financeira:</w:t>
+      </w:r>
+      <w:r>
+        <w:rPr>
+          <w:rFonts w:ascii="Calibri" w:cs="Calibri" w:eastAsia="Calibri" w:hAnsi="Calibri"/>
+          <w:rtl w:val="0"/>
+        </w:rPr>
+        <w:t xml:space="preserve"> Implementação de checkout customizado (Stripe Elements) e sincronização de assinaturas recorrentes via Webhooks para estudo de consistência de dados.</w:t>
+      </w:r>
+    </w:p>
+    <w:p>
+      <w:pPr>
+        <w:spacing w:after="240" w:before="240" w:lineRule="auto"/>
+        <w:ind w:left="0" w:firstLine="0"/>
+        <w:rPr>
+          <w:rFonts w:ascii="Calibri" w:cs="Calibri" w:eastAsia="Calibri" w:hAnsi="Calibri"/>
+        </w:rPr>
+      </w:pPr>
+      <w:r>
+        <w:rPr>
+          <w:rFonts w:ascii="Calibri" w:cs="Calibri" w:eastAsia="Calibri" w:hAnsi="Calibri"/>
+          <w:b w:val="1"/>
+          <w:bCs w:val="1"/>
+          <w:rtl w:val="0"/>
+        </w:rPr>
+        <w:t xml:space="preserve">Arquitetura de Segurança:</w:t>
+      </w:r>
+      <w:r>
+        <w:rPr>
+          <w:rFonts w:ascii="Calibri" w:cs="Calibri" w:eastAsia="Calibri" w:hAnsi="Calibri"/>
+          <w:rtl w:val="0"/>
+        </w:rPr>
+        <w:t xml:space="preserve"> Sistema de login utilizando Auth.js com autenticação em duas etapas (2FA) e isolamento de banco de dados via Data Access Layer (DAL). </w:t>
+      </w:r>
+    </w:p>
+    <w:p>
+      <w:pPr>
+        <w:spacing w:after="240" w:before="240" w:lineRule="auto"/>
+        <w:ind w:left="0" w:firstLine="0"/>
+        <w:rPr>
+          <w:rFonts w:ascii="Calibri" w:cs="Calibri" w:eastAsia="Calibri" w:hAnsi="Calibri"/>
+        </w:rPr>
+      </w:pPr>
+      <w:r>
+        <w:rPr>
+          <w:rFonts w:ascii="Calibri" w:cs="Calibri" w:eastAsia="Calibri" w:hAnsi="Calibri"/>
+          <w:b w:val="1"/>
+          <w:bCs w:val="1"/>
+          <w:rtl w:val="0"/>
+        </w:rPr>
+        <w:t xml:space="preserve">Performance e Infraestrutura:</w:t>
+      </w:r>
+      <w:r>
+        <w:rPr>
+          <w:rFonts w:ascii="Calibri" w:cs="Calibri" w:eastAsia="Calibri" w:hAnsi="Calibri"/>
+          <w:rtl w:val="0"/>
+        </w:rPr>
+        <w:t xml:space="preserve">  Gerenciamento de estado global com Zustand, conteinerização com Docker e modelagem de banco de dados PostgreSQL via Prisma ORM. </w:t>
+      </w:r>
+    </w:p>
+    <w:p>
+      <w:pPr>
+        <w:spacing w:after="240" w:before="240" w:lineRule="auto"/>
+        <w:ind w:left="0" w:firstLine="0"/>
+        <w:rPr>
+          <w:rFonts w:ascii="Calibri" w:cs="Calibri" w:eastAsia="Calibri" w:hAnsi="Calibri"/>
+        </w:rPr>
+      </w:pPr>
+      <w:r>
+        <w:rPr>
+          <w:rFonts w:ascii="Calibri" w:cs="Calibri" w:eastAsia="Calibri" w:hAnsi="Calibri"/>
+          <w:b w:val="1"/>
+          <w:bCs w:val="1"/>
+          <w:rtl w:val="0"/>
+        </w:rPr>
+        <w:t xml:space="preserve">API RESTful para E-commerce (Projeto Back-end)</w:t>
+      </w:r>
+      <w:r>
+        <w:rPr>
+          <w:rFonts w:ascii="Calibri" w:cs="Calibri" w:eastAsia="Calibri" w:hAnsi="Calibri"/>
+          <w:rtl w:val="0"/>
+        </w:rPr>
+        <w:t xml:space="preserve"> |</w:t>
+      </w:r>
+      <w:r>
+        <w:rPr>
+          <w:rFonts w:ascii="Calibri" w:cs="Calibri" w:eastAsia="Calibri" w:hAnsi="Calibri"/>
+          <w:i w:val="1"/>
+          <w:iCs w:val="1"/>
+          <w:rtl w:val="0"/>
+        </w:rPr>
+        <w:t xml:space="preserve"> 2026</w:t>
+      </w:r>
+      <w:r>
+        <w:rPr>
+          <w:rFonts w:ascii="Calibri" w:cs="Calibri" w:eastAsia="Calibri" w:hAnsi="Calibri"/>
+          <w:rtl w:val="0"/>
+        </w:rPr>
+        <w:t xml:space="preserve"> </w:t>
+      </w:r>
+    </w:p>
+    <w:p>
+      <w:pPr>
+        <w:spacing w:after="240" w:before="240" w:lineRule="auto"/>
+        <w:ind w:left="0" w:firstLine="0"/>
+        <w:rPr>
+          <w:rFonts w:ascii="Calibri" w:cs="Calibri" w:eastAsia="Calibri" w:hAnsi="Calibri"/>
+          <w:i w:val="1"/>
+          <w:iCs w:val="1"/>
+        </w:rPr>
+      </w:pPr>
+      <w:r>
+        <w:rPr>
+          <w:rFonts w:ascii="Calibri" w:cs="Calibri" w:eastAsia="Calibri" w:hAnsi="Calibri"/>
+          <w:rtl w:val="0"/>
+        </w:rPr>
+        <w:t xml:space="preserve">Desenvolvimento de back-end focado em consolidar fundamentos de performance, organização, segurança de rotas e modelagem de dados com Node.js e Fastify. </w:t>
+      </w:r>
+      <w:r>
+        <w:rPr>
+          <w:rtl w:val="0"/>
+        </w:rPr>
+      </w:r>
+    </w:p>
+    <w:p>
+      <w:pPr>
+        <w:spacing w:after="240" w:before="240" w:lineRule="auto"/>
+        <w:ind w:left="0" w:firstLine="0"/>
+        <w:rPr>
+          <w:rFonts w:ascii="Calibri" w:cs="Calibri" w:eastAsia="Calibri" w:hAnsi="Calibri"/>
+        </w:rPr>
+      </w:pPr>
+      <w:r>
+        <w:rPr>
+          <w:rFonts w:ascii="Calibri" w:cs="Calibri" w:eastAsia="Calibri" w:hAnsi="Calibri"/>
+          <w:b w:val="1"/>
+          <w:bCs w:val="1"/>
+          <w:rtl w:val="0"/>
+        </w:rPr>
+        <w:t xml:space="preserve">Performance e Cache:</w:t>
+      </w:r>
+      <w:r>
+        <w:rPr>
+          <w:rFonts w:ascii="Calibri" w:cs="Calibri" w:eastAsia="Calibri" w:hAnsi="Calibri"/>
+          <w:rtl w:val="0"/>
+        </w:rPr>
+        <w:t xml:space="preserve"> Utilização do Redis para armazenar metadados de ordens de serviço, contornando a latência de APIs externas.</w:t>
+      </w:r>
+    </w:p>
+    <w:p>
+      <w:pPr>
+        <w:spacing w:after="240" w:before="240" w:lineRule="auto"/>
+        <w:ind w:left="0" w:firstLine="0"/>
+        <w:rPr>
+          <w:rFonts w:ascii="Calibri" w:cs="Calibri" w:eastAsia="Calibri" w:hAnsi="Calibri"/>
+        </w:rPr>
+      </w:pPr>
+      <w:r>
+        <w:rPr>
+          <w:rFonts w:ascii="Calibri" w:cs="Calibri" w:eastAsia="Calibri" w:hAnsi="Calibri"/>
+          <w:b w:val="1"/>
+          <w:bCs w:val="1"/>
+          <w:rtl w:val="0"/>
+        </w:rPr>
+        <w:t xml:space="preserve">Controle de Acesso:</w:t>
+      </w:r>
+      <w:r>
+        <w:rPr>
+          <w:rFonts w:ascii="Calibri" w:cs="Calibri" w:eastAsia="Calibri" w:hAnsi="Calibri"/>
+          <w:rtl w:val="0"/>
+        </w:rPr>
+        <w:t xml:space="preserve"> Construção de autenticação segura via Cookies e JWT, com validação de tipagem via Zod e níveis de acesso restritos.</w:t>
+      </w:r>
+    </w:p>
+    <w:p>
+      <w:pPr>
+        <w:spacing w:after="240" w:before="240" w:lineRule="auto"/>
+        <w:ind w:left="0" w:firstLine="0"/>
+        <w:rPr>
+          <w:rFonts w:ascii="Calibri" w:cs="Calibri" w:eastAsia="Calibri" w:hAnsi="Calibri"/>
+          <w:b w:val="1"/>
+          <w:bCs w:val="1"/>
+        </w:rPr>
+      </w:pPr>
+      <w:r>
+        <w:rPr>
+          <w:rFonts w:ascii="Calibri" w:cs="Calibri" w:eastAsia="Calibri" w:hAnsi="Calibri"/>
+          <w:b w:val="1"/>
+          <w:bCs w:val="1"/>
+          <w:rtl w:val="0"/>
+        </w:rPr>
+        <w:t xml:space="preserve">Arquitetura:</w:t>
+      </w:r>
+      <w:r>
+        <w:rPr>
+          <w:rFonts w:ascii="Calibri" w:cs="Calibri" w:eastAsia="Calibri" w:hAnsi="Calibri"/>
+          <w:rtl w:val="0"/>
+        </w:rPr>
+        <w:t xml:space="preserve"> Estruturação modular da aplicação utilizando PostgreSQL, com a API documentada via Swagger UI</w:t>
+      </w:r>
+      <w:r>
+        <w:rPr>
+          <w:rtl w:val="0"/>
+        </w:rPr>
+      </w:r>
+    </w:p>
+    <w:p>
+      <w:pPr>
+        <w:rPr>
+          <w:rFonts w:ascii="Calibri" w:cs="Calibri" w:eastAsia="Calibri" w:hAnsi="Calibri"/>
+        </w:rPr>
+      </w:pPr>
+      <w:r>
+        <w:rPr>
+          <w:rtl w:val="0"/>
+        </w:rPr>
+      </w:r>
+    </w:p>
+    <w:p>
+      <w:pPr>
+        <w:ind w:left="0" w:firstLine="0"/>
         <w:rPr>
           <w:rFonts w:ascii="Calibri" w:cs="Calibri" w:eastAsia="Calibri" w:hAnsi="Calibri"/>
           <w:b w:val="1"/>
           <w:bCs w:val="1"/>
           <w:sz w:val="32"/>
           <w:szCs w:val="32"/>
-          <w:rtl w:val="0"/>
-        </w:rPr>
-        <w:t xml:space="preserve">Experiência Profissional e Projetos Práticos </w:t>
-      </w:r>
-      <w:r>
-        <w:rPr>
-          <w:rtl w:val="0"/>
-        </w:rPr>
-      </w:r>
-    </w:p>
-    <w:p>
-      <w:pPr>
-        <w:spacing w:after="240" w:before="240" w:lineRule="auto"/>
-        <w:rPr>
-          <w:rFonts w:ascii="Calibri" w:cs="Calibri" w:eastAsia="Calibri" w:hAnsi="Calibri"/>
-          <w:b w:val="1"/>
-          <w:bCs w:val="1"/>
-          <w:i w:val="1"/>
-          <w:iCs w:val="1"/>
-        </w:rPr>
-      </w:pPr>
-      <w:r>
-        <w:rPr>
-          <w:rFonts w:ascii="Calibri" w:cs="Calibri" w:eastAsia="Calibri" w:hAnsi="Calibri"/>
-          <w:b w:val="1"/>
-          <w:bCs w:val="1"/>
-          <w:i w:val="1"/>
-          <w:iCs w:val="1"/>
-          <w:rtl w:val="0"/>
-        </w:rPr>
-        <w:t xml:space="preserve">Desenvolvedor Full Stack (Projetos Autônomos) | 2025 – Atual</w:t>
-      </w:r>
-    </w:p>
-    <w:p>
-      <w:pPr>
-        <w:rPr>
-          <w:rFonts w:ascii="Calibri" w:cs="Calibri" w:eastAsia="Calibri" w:hAnsi="Calibri"/>
-        </w:rPr>
-      </w:pPr>
-      <w:r>
-        <w:rPr>
-          <w:rFonts w:ascii="Calibri" w:cs="Calibri" w:eastAsia="Calibri" w:hAnsi="Calibri"/>
-          <w:rtl w:val="0"/>
-        </w:rPr>
-        <w:t xml:space="preserve">Desenvolvimento de aplicação Full Stack de e-commerce SaaS utilizando Next.js (App Router), React e Server Components, implementando estratégias avançadas de cache e renderização dinâmica para otimização de performance.</w:t>
-      </w:r>
-    </w:p>
-    <w:p>
-      <w:pPr>
-        <w:rPr>
-          <w:rFonts w:ascii="Calibri" w:cs="Calibri" w:eastAsia="Calibri" w:hAnsi="Calibri"/>
-        </w:rPr>
-      </w:pPr>
-      <w:r>
-        <w:rPr>
-          <w:rFonts w:ascii="Calibri" w:cs="Calibri" w:eastAsia="Calibri" w:hAnsi="Calibri"/>
-          <w:rtl w:val="0"/>
-        </w:rPr>
-        <w:t xml:space="preserve">Criação de API RESTful robusta com Fastify e TypeScript, incluindo validações com Zod e integração com banco de dados relacional PostgreSQL via Prisma ORM.</w:t>
-      </w:r>
-    </w:p>
-    <w:p>
-      <w:pPr>
-        <w:rPr>
-          <w:rFonts w:ascii="Calibri" w:cs="Calibri" w:eastAsia="Calibri" w:hAnsi="Calibri"/>
-        </w:rPr>
-      </w:pPr>
-      <w:r>
-        <w:rPr>
-          <w:rFonts w:ascii="Calibri" w:cs="Calibri" w:eastAsia="Calibri" w:hAnsi="Calibri"/>
-          <w:rtl w:val="0"/>
-        </w:rPr>
-        <w:t xml:space="preserve">Orquestração completa de fluxos financeiros com Stripe (Elements, SDK, webhooks), gerenciando checkout customizado, assinaturas recorrentes, wallet segura e sincronização em tempo real.</w:t>
-      </w:r>
-    </w:p>
-    <w:p>
-      <w:pPr>
-        <w:rPr>
-          <w:rFonts w:ascii="Calibri" w:cs="Calibri" w:eastAsia="Calibri" w:hAnsi="Calibri"/>
-        </w:rPr>
-      </w:pPr>
-      <w:r>
-        <w:rPr>
-          <w:rFonts w:ascii="Calibri" w:cs="Calibri" w:eastAsia="Calibri" w:hAnsi="Calibri"/>
-          <w:rtl w:val="0"/>
-        </w:rPr>
-        <w:t xml:space="preserve">Implementação de camadas de segurança avançadas: Data Access Layer (DAL), autenticação com Auth.js (NextAuth) + 2FA, JWT e recuperação de senha.</w:t>
-      </w:r>
-    </w:p>
-    <w:p>
-      <w:pPr>
-        <w:rPr>
-          <w:rFonts w:ascii="Calibri" w:cs="Calibri" w:eastAsia="Calibri" w:hAnsi="Calibri"/>
-        </w:rPr>
-      </w:pPr>
-      <w:r>
-        <w:rPr>
-          <w:rFonts w:ascii="Calibri" w:cs="Calibri" w:eastAsia="Calibri" w:hAnsi="Calibri"/>
-          <w:rtl w:val="0"/>
-        </w:rPr>
-        <w:t xml:space="preserve">Configuração de ambiente DevOps com Docker para PostgreSQL e Redis, garantindo padronização e escalabilidade.</w:t>
-      </w:r>
-    </w:p>
-    <w:p>
-      <w:pPr>
-        <w:rPr>
-          <w:rFonts w:ascii="Calibri" w:cs="Calibri" w:eastAsia="Calibri" w:hAnsi="Calibri"/>
-          <w:b w:val="1"/>
-          <w:bCs w:val="1"/>
-        </w:rPr>
-      </w:pPr>
-      <w:r>
-        <w:rPr>
-          <w:rtl w:val="0"/>
-        </w:rPr>
-      </w:r>
-    </w:p>
-    <w:p>
-      <w:pPr>
-        <w:rPr>
-          <w:rFonts w:ascii="Calibri" w:cs="Calibri" w:eastAsia="Calibri" w:hAnsi="Calibri"/>
-          <w:b w:val="1"/>
-          <w:bCs w:val="1"/>
-        </w:rPr>
-      </w:pPr>
-      <w:r>
-        <w:rPr>
-          <w:rFonts w:ascii="Calibri" w:cs="Calibri" w:eastAsia="Calibri" w:hAnsi="Calibri"/>
-          <w:b w:val="1"/>
-          <w:bCs w:val="1"/>
-          <w:rtl w:val="0"/>
-        </w:rPr>
-        <w:t xml:space="preserve">Supermercados BH - Operador de Caixa</w:t>
-      </w:r>
-      <w:r>
-        <w:rPr>
-          <w:rFonts w:ascii="Calibri" w:cs="Calibri" w:eastAsia="Calibri" w:hAnsi="Calibri"/>
-          <w:rtl w:val="0"/>
-        </w:rPr>
-        <w:t xml:space="preserve"> |</w:t>
-      </w:r>
-      <w:r>
-        <w:rPr>
-          <w:rFonts w:ascii="Calibri" w:cs="Calibri" w:eastAsia="Calibri" w:hAnsi="Calibri"/>
-          <w:b w:val="1"/>
-          <w:bCs w:val="1"/>
-          <w:rtl w:val="0"/>
-        </w:rPr>
-        <w:t xml:space="preserve"> 2024 – Atual </w:t>
-      </w:r>
-    </w:p>
-    <w:p>
-      <w:pPr>
-        <w:spacing w:after="240" w:before="240" w:lineRule="auto"/>
-        <w:ind w:left="0" w:firstLine="0"/>
-        <w:rPr>
-          <w:rFonts w:ascii="Calibri" w:cs="Calibri" w:eastAsia="Calibri" w:hAnsi="Calibri"/>
-        </w:rPr>
-      </w:pPr>
-      <w:r>
-        <w:rPr>
-          <w:rFonts w:ascii="Calibri" w:cs="Calibri" w:eastAsia="Calibri" w:hAnsi="Calibri"/>
-          <w:rtl w:val="0"/>
-        </w:rPr>
-        <w:t xml:space="preserve">Atendimento direto ao público com ênfase em comunicação assertiva, resolução rápida de problemas sob pressão e trabalho em equipe.</w:t>
-      </w:r>
-    </w:p>
-    <w:p>
-      <w:pPr>
-        <w:spacing w:after="240" w:before="240" w:lineRule="auto"/>
-        <w:ind w:left="0" w:firstLine="0"/>
-        <w:rPr>
-          <w:rFonts w:ascii="Calibri" w:cs="Calibri" w:eastAsia="Calibri" w:hAnsi="Calibri"/>
-        </w:rPr>
-      </w:pPr>
-      <w:r>
-        <w:rPr>
-          <w:rFonts w:ascii="Calibri" w:cs="Calibri" w:eastAsia="Calibri" w:hAnsi="Calibri"/>
-          <w:rtl w:val="0"/>
-        </w:rPr>
-        <w:t xml:space="preserve">Desenvolvimento de agilidade operacional, inteligência emocional e responsabilidade financeira.</w:t>
-      </w:r>
-    </w:p>
-    <w:p>
-      <w:pPr>
-        <w:ind w:left="0" w:firstLine="0"/>
+        </w:rPr>
+      </w:pPr>
+      <w:r>
         <w:rPr>
           <w:rFonts w:ascii="Calibri" w:cs="Calibri" w:eastAsia="Calibri" w:hAnsi="Calibri"/>
           <w:b w:val="1"/>
           <w:bCs w:val="1"/>
           <w:sz w:val="32"/>
           <w:szCs w:val="32"/>
-        </w:rPr>
-      </w:pPr>
-      <w:r>
+          <w:rtl w:val="0"/>
+        </w:rPr>
+        <w:t xml:space="preserve">Educação </w:t>
+      </w:r>
+    </w:p>
+    <w:p>
+      <w:pPr>
+        <w:ind w:left="0" w:firstLine="0"/>
+        <w:rPr>
+          <w:rFonts w:ascii="Calibri" w:cs="Calibri" w:eastAsia="Calibri" w:hAnsi="Calibri"/>
+        </w:rPr>
+      </w:pPr>
+      <w:r>
+        <w:rPr>
+          <w:rFonts w:ascii="Calibri" w:cs="Calibri" w:eastAsia="Calibri" w:hAnsi="Calibri"/>
+          <w:rtl w:val="0"/>
+        </w:rPr>
+        <w:t xml:space="preserve">Análise e Desenvolvimento de Sistemas </w:t>
+      </w:r>
+      <w:r>
+        <w:rPr>
+          <w:rFonts w:ascii="Calibri" w:cs="Calibri" w:eastAsia="Calibri" w:hAnsi="Calibri"/>
+          <w:b w:val="1"/>
+          <w:bCs w:val="1"/>
+          <w:rtl w:val="0"/>
+        </w:rPr>
+        <w:t xml:space="preserve">(Modalidade EAD - Flexibilidade de horários)</w:t>
+      </w:r>
+      <w:r>
+        <w:rPr>
+          <w:rFonts w:ascii="Calibri" w:cs="Calibri" w:eastAsia="Calibri" w:hAnsi="Calibri"/>
+          <w:rtl w:val="0"/>
+        </w:rPr>
+        <w:t xml:space="preserve"> </w:t>
+      </w:r>
+    </w:p>
+    <w:p>
+      <w:pPr>
+        <w:ind w:left="0" w:firstLine="0"/>
+        <w:rPr>
+          <w:rFonts w:ascii="Calibri" w:cs="Calibri" w:eastAsia="Calibri" w:hAnsi="Calibri"/>
+        </w:rPr>
+      </w:pPr>
+      <w:r>
+        <w:rPr>
+          <w:rFonts w:ascii="Calibri" w:cs="Calibri" w:eastAsia="Calibri" w:hAnsi="Calibri"/>
+          <w:rtl w:val="0"/>
+        </w:rPr>
+        <w:t xml:space="preserve">UniCesumar 2025  – Conclusão prevista para 2027</w:t>
+      </w:r>
+    </w:p>
+    <w:p>
+      <w:pPr>
+        <w:spacing w:after="240" w:before="240" w:lineRule="auto"/>
+        <w:rPr>
+          <w:rFonts w:ascii="Calibri" w:cs="Calibri" w:eastAsia="Calibri" w:hAnsi="Calibri"/>
+        </w:rPr>
+      </w:pPr>
+      <w:r>
+        <w:rPr>
+          <w:rFonts w:ascii="Calibri" w:cs="Calibri" w:eastAsia="Calibri" w:hAnsi="Calibri"/>
+          <w:rtl w:val="0"/>
+        </w:rPr>
+        <w:t xml:space="preserve">Principais conceitos aplicados na prática: Lógica de Programação, Arquitetura de Software, Bancos de Dados Relacionais e Não Relacionais</w:t>
+      </w:r>
+    </w:p>
+    <w:p>
+      <w:pPr>
+        <w:ind w:left="0" w:firstLine="0"/>
         <w:rPr>
           <w:rFonts w:ascii="Calibri" w:cs="Calibri" w:eastAsia="Calibri" w:hAnsi="Calibri"/>
           <w:b w:val="1"/>
           <w:bCs w:val="1"/>
           <w:sz w:val="32"/>
           <w:szCs w:val="32"/>
-          <w:rtl w:val="0"/>
-        </w:rPr>
-        <w:t xml:space="preserve">Educação </w:t>
-      </w:r>
-    </w:p>
-    <w:p>
-      <w:pPr>
-        <w:ind w:left="0" w:firstLine="0"/>
-        <w:rPr>
-          <w:rFonts w:ascii="Calibri" w:cs="Calibri" w:eastAsia="Calibri" w:hAnsi="Calibri"/>
-          <w:i w:val="1"/>
-          <w:iCs w:val="1"/>
-        </w:rPr>
-      </w:pPr>
-      <w:r>
-        <w:rPr>
-          <w:rFonts w:ascii="Calibri" w:cs="Calibri" w:eastAsia="Calibri" w:hAnsi="Calibri"/>
-          <w:i w:val="1"/>
-          <w:iCs w:val="1"/>
-          <w:rtl w:val="0"/>
-        </w:rPr>
-        <w:t xml:space="preserve">Análise e Desenvolvimento de Sistemas </w:t>
-      </w:r>
-      <w:r>
-        <w:rPr>
-          <w:rFonts w:ascii="Calibri" w:cs="Calibri" w:eastAsia="Calibri" w:hAnsi="Calibri"/>
-          <w:b w:val="1"/>
-          <w:bCs w:val="1"/>
-          <w:i w:val="1"/>
-          <w:iCs w:val="1"/>
-          <w:rtl w:val="0"/>
-        </w:rPr>
-        <w:t xml:space="preserve">(Modalidade EAD - Flexibilidade de horários)</w:t>
-      </w:r>
-      <w:r>
-        <w:rPr>
-          <w:rFonts w:ascii="Calibri" w:cs="Calibri" w:eastAsia="Calibri" w:hAnsi="Calibri"/>
-          <w:i w:val="1"/>
-          <w:iCs w:val="1"/>
-          <w:rtl w:val="0"/>
-        </w:rPr>
-        <w:t xml:space="preserve"> </w:t>
-      </w:r>
-    </w:p>
-    <w:p>
-      <w:pPr>
-        <w:ind w:left="0" w:firstLine="0"/>
-        <w:rPr>
-          <w:rFonts w:ascii="Calibri" w:cs="Calibri" w:eastAsia="Calibri" w:hAnsi="Calibri"/>
-          <w:i w:val="1"/>
-          <w:iCs w:val="1"/>
-        </w:rPr>
-      </w:pPr>
-      <w:r>
-        <w:rPr>
-          <w:rFonts w:ascii="Calibri" w:cs="Calibri" w:eastAsia="Calibri" w:hAnsi="Calibri"/>
-          <w:i w:val="1"/>
-          <w:iCs w:val="1"/>
-          <w:rtl w:val="0"/>
-        </w:rPr>
-        <w:t xml:space="preserve">UniCesumar – Conclusão prevista para 2027</w:t>
-      </w:r>
-    </w:p>
-    <w:p>
-      <w:pPr>
-        <w:spacing w:after="240" w:before="240" w:lineRule="auto"/>
-        <w:rPr>
-          <w:rFonts w:ascii="Calibri" w:cs="Calibri" w:eastAsia="Calibri" w:hAnsi="Calibri"/>
-          <w:i w:val="1"/>
-          <w:iCs w:val="1"/>
-        </w:rPr>
-      </w:pPr>
-      <w:r>
-        <w:rPr>
-          <w:rFonts w:ascii="Calibri" w:cs="Calibri" w:eastAsia="Calibri" w:hAnsi="Calibri"/>
-          <w:i w:val="1"/>
-          <w:iCs w:val="1"/>
-          <w:rtl w:val="0"/>
-        </w:rPr>
-        <w:t xml:space="preserve">Principais conceitos aplicados: Lógica de Programação, Arquitetura de Software, Banco de Dados Relacionais e Segurança da Informação.</w:t>
-      </w:r>
-    </w:p>
-    <w:p>
-      <w:pPr>
-        <w:ind w:left="0" w:firstLine="0"/>
+        </w:rPr>
+      </w:pPr>
+      <w:r>
         <w:rPr>
           <w:rFonts w:ascii="Calibri" w:cs="Calibri" w:eastAsia="Calibri" w:hAnsi="Calibri"/>
           <w:b w:val="1"/>
           <w:bCs w:val="1"/>
           <w:sz w:val="32"/>
           <w:szCs w:val="32"/>
-        </w:rPr>
-      </w:pPr>
-      <w:r>
-        <w:rPr>
-          <w:rFonts w:ascii="Calibri" w:cs="Calibri" w:eastAsia="Calibri" w:hAnsi="Calibri"/>
-          <w:b w:val="1"/>
-          <w:bCs w:val="1"/>
-          <w:sz w:val="32"/>
-          <w:szCs w:val="32"/>
           <w:rtl w:val="0"/>
         </w:rPr>
         <w:t xml:space="preserve">Skillset </w:t>
@@ -603,9 +674,162 @@
       <w:r>
         <w:rPr>
           <w:rFonts w:ascii="Calibri" w:cs="Calibri" w:eastAsia="Calibri" w:hAnsi="Calibri"/>
-          <w:rtl w:val="0"/>
-        </w:rPr>
-        <w:t xml:space="preserve">TypeScript, JavaScript, Node.js, React, Next.js, Fastify, PostgreSQL, Prisma ORM, Redis, Docker, Tailwind CSS, Zustand, Stripe API, JWT, Auth.js, Git, Swagger, Zod.</w:t>
+          <w:b w:val="1"/>
+          <w:bCs w:val="1"/>
+          <w:rtl w:val="0"/>
+        </w:rPr>
+        <w:t xml:space="preserve">Linguagens:</w:t>
+      </w:r>
+      <w:r>
+        <w:rPr>
+          <w:rFonts w:ascii="Calibri" w:cs="Calibri" w:eastAsia="Calibri" w:hAnsi="Calibri"/>
+          <w:rtl w:val="0"/>
+        </w:rPr>
+        <w:t xml:space="preserve"> TypeScript, JavaScript </w:t>
+      </w:r>
+    </w:p>
+    <w:p>
+      <w:pPr>
+        <w:spacing w:after="240" w:before="240" w:lineRule="auto"/>
+        <w:rPr>
+          <w:rFonts w:ascii="Calibri" w:cs="Calibri" w:eastAsia="Calibri" w:hAnsi="Calibri"/>
+        </w:rPr>
+      </w:pPr>
+      <w:r>
+        <w:rPr>
+          <w:rFonts w:ascii="Calibri" w:cs="Calibri" w:eastAsia="Calibri" w:hAnsi="Calibri"/>
+          <w:b w:val="1"/>
+          <w:bCs w:val="1"/>
+          <w:rtl w:val="0"/>
+        </w:rPr>
+        <w:t xml:space="preserve">Frontend:</w:t>
+      </w:r>
+      <w:r>
+        <w:rPr>
+          <w:rFonts w:ascii="Calibri" w:cs="Calibri" w:eastAsia="Calibri" w:hAnsi="Calibri"/>
+          <w:rtl w:val="0"/>
+        </w:rPr>
+        <w:t xml:space="preserve"> React, Next.js, Tailwind CSS </w:t>
+      </w:r>
+    </w:p>
+    <w:p>
+      <w:pPr>
+        <w:spacing w:after="240" w:before="240" w:lineRule="auto"/>
+        <w:rPr>
+          <w:rFonts w:ascii="Calibri" w:cs="Calibri" w:eastAsia="Calibri" w:hAnsi="Calibri"/>
+        </w:rPr>
+      </w:pPr>
+      <w:r>
+        <w:rPr>
+          <w:rFonts w:ascii="Calibri" w:cs="Calibri" w:eastAsia="Calibri" w:hAnsi="Calibri"/>
+          <w:b w:val="1"/>
+          <w:bCs w:val="1"/>
+          <w:rtl w:val="0"/>
+        </w:rPr>
+        <w:t xml:space="preserve">Backend:</w:t>
+      </w:r>
+      <w:r>
+        <w:rPr>
+          <w:rFonts w:ascii="Calibri" w:cs="Calibri" w:eastAsia="Calibri" w:hAnsi="Calibri"/>
+          <w:rtl w:val="0"/>
+        </w:rPr>
+        <w:t xml:space="preserve"> Node.js, Fastify </w:t>
+      </w:r>
+    </w:p>
+    <w:p>
+      <w:pPr>
+        <w:spacing w:after="240" w:before="240" w:lineRule="auto"/>
+        <w:rPr>
+          <w:rFonts w:ascii="Calibri" w:cs="Calibri" w:eastAsia="Calibri" w:hAnsi="Calibri"/>
+        </w:rPr>
+      </w:pPr>
+      <w:r>
+        <w:rPr>
+          <w:rFonts w:ascii="Calibri" w:cs="Calibri" w:eastAsia="Calibri" w:hAnsi="Calibri"/>
+          <w:b w:val="1"/>
+          <w:bCs w:val="1"/>
+          <w:rtl w:val="0"/>
+        </w:rPr>
+        <w:t xml:space="preserve">Banco de Dados:</w:t>
+      </w:r>
+      <w:r>
+        <w:rPr>
+          <w:rFonts w:ascii="Calibri" w:cs="Calibri" w:eastAsia="Calibri" w:hAnsi="Calibri"/>
+          <w:rtl w:val="0"/>
+        </w:rPr>
+        <w:t xml:space="preserve"> PostgreSQL, Prisma ORM, Redis </w:t>
+      </w:r>
+    </w:p>
+    <w:p>
+      <w:pPr>
+        <w:spacing w:after="240" w:before="240" w:lineRule="auto"/>
+        <w:rPr>
+          <w:rFonts w:ascii="Calibri" w:cs="Calibri" w:eastAsia="Calibri" w:hAnsi="Calibri"/>
+        </w:rPr>
+      </w:pPr>
+      <w:r>
+        <w:rPr>
+          <w:rFonts w:ascii="Calibri" w:cs="Calibri" w:eastAsia="Calibri" w:hAnsi="Calibri"/>
+          <w:b w:val="1"/>
+          <w:bCs w:val="1"/>
+          <w:rtl w:val="0"/>
+        </w:rPr>
+        <w:t xml:space="preserve">Infraestrutura:</w:t>
+      </w:r>
+      <w:r>
+        <w:rPr>
+          <w:rFonts w:ascii="Calibri" w:cs="Calibri" w:eastAsia="Calibri" w:hAnsi="Calibri"/>
+          <w:rtl w:val="0"/>
+        </w:rPr>
+        <w:t xml:space="preserve"> Docker </w:t>
+      </w:r>
+    </w:p>
+    <w:p>
+      <w:pPr>
+        <w:spacing w:after="240" w:before="240" w:lineRule="auto"/>
+        <w:rPr>
+          <w:rFonts w:ascii="Calibri" w:cs="Calibri" w:eastAsia="Calibri" w:hAnsi="Calibri"/>
+        </w:rPr>
+      </w:pPr>
+      <w:r>
+        <w:rPr>
+          <w:rFonts w:ascii="Calibri" w:cs="Calibri" w:eastAsia="Calibri" w:hAnsi="Calibri"/>
+          <w:b w:val="1"/>
+          <w:bCs w:val="1"/>
+          <w:rtl w:val="0"/>
+        </w:rPr>
+        <w:t xml:space="preserve">Autenticação e Segurança:</w:t>
+      </w:r>
+      <w:r>
+        <w:rPr>
+          <w:rFonts w:ascii="Calibri" w:cs="Calibri" w:eastAsia="Calibri" w:hAnsi="Calibri"/>
+          <w:rtl w:val="0"/>
+        </w:rPr>
+        <w:t xml:space="preserve"> Auth.js, JWT</w:t>
+      </w:r>
+    </w:p>
+    <w:p>
+      <w:pPr>
+        <w:spacing w:after="240" w:before="240" w:lineRule="auto"/>
+        <w:rPr>
+          <w:rFonts w:ascii="Calibri" w:cs="Calibri" w:eastAsia="Calibri" w:hAnsi="Calibri"/>
+        </w:rPr>
+      </w:pPr>
+      <w:r>
+        <w:rPr>
+          <w:rFonts w:ascii="Calibri" w:cs="Calibri" w:eastAsia="Calibri" w:hAnsi="Calibri"/>
+          <w:b w:val="1"/>
+          <w:bCs w:val="1"/>
+          <w:rtl w:val="0"/>
+        </w:rPr>
+        <w:t xml:space="preserve">Ferramentas:</w:t>
+      </w:r>
+      <w:r>
+        <w:rPr>
+          <w:rFonts w:ascii="Calibri" w:cs="Calibri" w:eastAsia="Calibri" w:hAnsi="Calibri"/>
+          <w:rtl w:val="0"/>
+        </w:rPr>
+        <w:t xml:space="preserve"> Git, Swagger, Zod, Stripe API, Zustand </w:t>
       </w:r>
     </w:p>
     <w:p>

</xml_diff>